<commit_message>
correzioni grammaticali, eliminazione refusi
</commit_message>
<xml_diff>
--- a/PARTE TERZA_DI CARO/LAB1_TLN3/Relazione_LAB1.docx
+++ b/PARTE TERZA_DI CARO/LAB1_TLN3/Relazione_LAB1.docx
@@ -16,7 +16,7 @@
           <v:rect id="rectole0000000000" o:spid="_x0000_i1025" style="width:76.8pt;height:76.8pt" o:ole="" o:preferrelative="t" stroked="f">
             <v:imagedata r:id="rId7" o:title=""/>
           </v:rect>
-          <o:OLEObject Type="Embed" ProgID="StaticMetafile" ShapeID="rectole0000000000" DrawAspect="Content" ObjectID="_1817902078" r:id="rId8"/>
+          <o:OLEObject Type="Embed" ProgID="StaticMetafile" ShapeID="rectole0000000000" DrawAspect="Content" ObjectID="_1818510833" r:id="rId8"/>
         </w:object>
       </w:r>
     </w:p>
@@ -123,7 +123,23 @@
           <w:b/>
           <w:sz w:val="32"/>
         </w:rPr>
-        <w:t>Tecnologie del Linguaggio Naturale-Parte II Prof. L. Di Caro</w:t>
+        <w:t>Tecnologie del Linguaggio Naturale-Parte II</w:t>
+      </w:r>
+      <w:r>
+        <w:rPr>
+          <w:rFonts w:ascii="Times New Roman" w:eastAsia="Times New Roman" w:hAnsi="Times New Roman" w:cs="Times New Roman"/>
+          <w:b/>
+          <w:sz w:val="32"/>
+        </w:rPr>
+        <w:t>I</w:t>
+      </w:r>
+      <w:r>
+        <w:rPr>
+          <w:rFonts w:ascii="Times New Roman" w:eastAsia="Times New Roman" w:hAnsi="Times New Roman" w:cs="Times New Roman"/>
+          <w:b/>
+          <w:sz w:val="32"/>
+        </w:rPr>
+        <w:t xml:space="preserve"> Prof. L. Di Caro</w:t>
       </w:r>
     </w:p>
     <w:p>
@@ -259,13 +275,7 @@
           <w:rFonts w:ascii="Times New Roman" w:eastAsia="Times New Roman" w:hAnsi="Times New Roman" w:cs="Times New Roman"/>
         </w:rPr>
         <w:lastRenderedPageBreak/>
-        <w:t xml:space="preserve">     </w:t>
-      </w:r>
-      <w:r>
-        <w:rPr>
-          <w:rFonts w:ascii="Times New Roman" w:eastAsia="Times New Roman" w:hAnsi="Times New Roman" w:cs="Times New Roman"/>
-        </w:rPr>
-        <w:t>L’obiettivo è quello di valutare  le prestazioni di WordNet e Wor2Vec in presenza di condizioni particolari quali la polisemia, la sinonimia, le relazioni gerarchiche, i concetti astratti e quelli concreti, le relazioni funzionali, l’appartenenza a categorie semantiche.</w:t>
+        <w:t xml:space="preserve">     L’obiettivo è quello di valutare  le prestazioni di WordNet e Wor2Vec in presenza di condizioni particolari quali la polisemia, la sinonimia, le relazioni gerarchiche, i concetti astratti e quelli concreti, le relazioni funzionali, l’appartenenza a categorie semantiche.</w:t>
       </w:r>
     </w:p>
     <w:p>
@@ -488,7 +498,7 @@
         <w:rPr>
           <w:rFonts w:ascii="Times New Roman" w:eastAsia="Times New Roman" w:hAnsi="Times New Roman" w:cs="Times New Roman"/>
         </w:rPr>
-        <w:t xml:space="preserve">prese due parole in input, calcola quanto queste sono semanticamente simili tra loro, utilizzando WordNet concentrandosi su un tipo di similarità chiamata path similarity che si basa sulla distanza tra i concetti (o "synset") nella gerarchia di WordNet ed ed assumi valori compresi tra 0 e 1 similmente alla cosine similarity. Più due concetti sono vicini nella gerarchia (cioè condividono un antenato comune a pochi passi di distanza), maggiore è la loro similarità. Se entrambe le </w:t>
+        <w:t xml:space="preserve">prese due parole in input, calcola quanto queste sono semanticamente simili tra loro, utilizzando WordNet concentrandosi su un tipo di similarità chiamata path similarity che si basa sulla distanza tra i concetti (o "synset") nella gerarchia di WordNet ed assumi valori compresi tra 0 e 1 similmente alla cosine similarity. Più due concetti sono vicini nella gerarchia (cioè condividono un antenato comune a pochi passi di distanza), maggiore è la loro similarità. Se entrambe le </w:t>
       </w:r>
       <w:r>
         <w:rPr>
@@ -790,13 +800,7 @@
         <w:rPr>
           <w:rFonts w:ascii="Times New Roman" w:eastAsia="Times New Roman" w:hAnsi="Times New Roman" w:cs="Times New Roman"/>
         </w:rPr>
-        <w:t xml:space="preserve">     </w:t>
-      </w:r>
-      <w:r>
-        <w:rPr>
-          <w:rFonts w:ascii="Times New Roman" w:eastAsia="Times New Roman" w:hAnsi="Times New Roman" w:cs="Times New Roman"/>
-        </w:rPr>
-        <w:t>Si riportano i risultati ottenuti utilizzando la lista di parole definita.</w:t>
+        <w:t xml:space="preserve">     Si riportano i risultati ottenuti utilizzando la lista di parole definita.</w:t>
       </w:r>
     </w:p>
     <w:p>
@@ -815,7 +819,7 @@
           <v:rect id="rectole0000000001" o:spid="_x0000_i1026" style="width:402pt;height:352.8pt" o:ole="" o:preferrelative="t" stroked="f">
             <v:imagedata r:id="rId10" o:title=""/>
           </v:rect>
-          <o:OLEObject Type="Embed" ProgID="StaticMetafile" ShapeID="rectole0000000001" DrawAspect="Content" ObjectID="_1817902079" r:id="rId11"/>
+          <o:OLEObject Type="Embed" ProgID="StaticMetafile" ShapeID="rectole0000000001" DrawAspect="Content" ObjectID="_1818510834" r:id="rId11"/>
         </w:object>
       </w:r>
     </w:p>
@@ -855,7 +859,7 @@
           <v:rect id="rectole0000000002" o:spid="_x0000_i1027" style="width:392.4pt;height:344.4pt" o:ole="" o:preferrelative="t" stroked="f">
             <v:imagedata r:id="rId12" o:title=""/>
           </v:rect>
-          <o:OLEObject Type="Embed" ProgID="StaticMetafile" ShapeID="rectole0000000002" DrawAspect="Content" ObjectID="_1817902080" r:id="rId13"/>
+          <o:OLEObject Type="Embed" ProgID="StaticMetafile" ShapeID="rectole0000000002" DrawAspect="Content" ObjectID="_1818510835" r:id="rId13"/>
         </w:object>
       </w:r>
     </w:p>
@@ -971,7 +975,7 @@
           <v:rect id="rectole0000000003" o:spid="_x0000_i1028" style="width:457.2pt;height:203.4pt" o:ole="" o:preferrelative="t" stroked="f">
             <v:imagedata r:id="rId14" o:title=""/>
           </v:rect>
-          <o:OLEObject Type="Embed" ProgID="StaticMetafile" ShapeID="rectole0000000003" DrawAspect="Content" ObjectID="_1817902081" r:id="rId15"/>
+          <o:OLEObject Type="Embed" ProgID="StaticMetafile" ShapeID="rectole0000000003" DrawAspect="Content" ObjectID="_1818510836" r:id="rId15"/>
         </w:object>
       </w:r>
     </w:p>

</xml_diff>

<commit_message>
Ulteriori correzioni primi 3 Lab
</commit_message>
<xml_diff>
--- a/PARTE TERZA_DI CARO/LAB1_TLN3/Relazione_LAB1.docx
+++ b/PARTE TERZA_DI CARO/LAB1_TLN3/Relazione_LAB1.docx
@@ -16,7 +16,7 @@
           <v:rect id="rectole0000000000" o:spid="_x0000_i1025" style="width:76.8pt;height:76.8pt" o:ole="" o:preferrelative="t" stroked="f">
             <v:imagedata r:id="rId7" o:title=""/>
           </v:rect>
-          <o:OLEObject Type="Embed" ProgID="StaticMetafile" ShapeID="rectole0000000000" DrawAspect="Content" ObjectID="_1818510833" r:id="rId8"/>
+          <o:OLEObject Type="Embed" ProgID="StaticMetafile" ShapeID="rectole0000000000" DrawAspect="Content" ObjectID="_1818689997" r:id="rId8"/>
         </w:object>
       </w:r>
     </w:p>
@@ -290,13 +290,12 @@
       <w:r>
         <w:rPr>
           <w:rFonts w:ascii="Times New Roman" w:eastAsia="Times New Roman" w:hAnsi="Times New Roman" w:cs="Times New Roman"/>
-          <w:noProof/>
         </w:rPr>
         <w:drawing>
-          <wp:inline distT="0" distB="0" distL="0" distR="0" wp14:anchorId="34C389AC" wp14:editId="4C8567B8">
-            <wp:extent cx="3208298" cy="3109229"/>
-            <wp:effectExtent l="0" t="0" r="0" b="0"/>
-            <wp:docPr id="1932686314" name="Immagine 1"/>
+          <wp:inline distT="0" distB="0" distL="0" distR="0" wp14:anchorId="5B3D8E75" wp14:editId="638F162A">
+            <wp:extent cx="3284505" cy="2987299"/>
+            <wp:effectExtent l="0" t="0" r="0" b="3810"/>
+            <wp:docPr id="168429405" name="Immagine 1"/>
             <wp:cNvGraphicFramePr>
               <a:graphicFrameLocks xmlns:a="http://schemas.openxmlformats.org/drawingml/2006/main" noChangeAspect="1"/>
             </wp:cNvGraphicFramePr>
@@ -304,7 +303,7 @@
               <a:graphicData uri="http://schemas.openxmlformats.org/drawingml/2006/picture">
                 <pic:pic xmlns:pic="http://schemas.openxmlformats.org/drawingml/2006/picture">
                   <pic:nvPicPr>
-                    <pic:cNvPr id="1932686314" name=""/>
+                    <pic:cNvPr id="168429405" name=""/>
                     <pic:cNvPicPr/>
                   </pic:nvPicPr>
                   <pic:blipFill>
@@ -316,7 +315,7 @@
                   <pic:spPr>
                     <a:xfrm>
                       <a:off x="0" y="0"/>
-                      <a:ext cx="3208298" cy="3109229"/>
+                      <a:ext cx="3284505" cy="2987299"/>
                     </a:xfrm>
                     <a:prstGeom prst="rect">
                       <a:avLst/>
@@ -815,12 +814,45 @@
         </w:rPr>
       </w:pPr>
       <w:r>
-        <w:object w:dxaOrig="8040" w:dyaOrig="7056" w14:anchorId="2D40515D">
-          <v:rect id="rectole0000000001" o:spid="_x0000_i1026" style="width:402pt;height:352.8pt" o:ole="" o:preferrelative="t" stroked="f">
-            <v:imagedata r:id="rId10" o:title=""/>
-          </v:rect>
-          <o:OLEObject Type="Embed" ProgID="StaticMetafile" ShapeID="rectole0000000001" DrawAspect="Content" ObjectID="_1818510834" r:id="rId11"/>
-        </w:object>
+        <w:rPr>
+          <w:rFonts w:ascii="Calibri" w:eastAsia="Calibri" w:hAnsi="Calibri" w:cs="Calibri"/>
+          <w:sz w:val="22"/>
+        </w:rPr>
+        <w:drawing>
+          <wp:inline distT="0" distB="0" distL="0" distR="0" wp14:anchorId="4C219FCF" wp14:editId="40845E06">
+            <wp:extent cx="3865880" cy="3394744"/>
+            <wp:effectExtent l="0" t="0" r="0" b="0"/>
+            <wp:docPr id="2062383429" name="Immagine 1"/>
+            <wp:cNvGraphicFramePr>
+              <a:graphicFrameLocks xmlns:a="http://schemas.openxmlformats.org/drawingml/2006/main" noChangeAspect="1"/>
+            </wp:cNvGraphicFramePr>
+            <a:graphic xmlns:a="http://schemas.openxmlformats.org/drawingml/2006/main">
+              <a:graphicData uri="http://schemas.openxmlformats.org/drawingml/2006/picture">
+                <pic:pic xmlns:pic="http://schemas.openxmlformats.org/drawingml/2006/picture">
+                  <pic:nvPicPr>
+                    <pic:cNvPr id="2062383429" name=""/>
+                    <pic:cNvPicPr/>
+                  </pic:nvPicPr>
+                  <pic:blipFill>
+                    <a:blip r:embed="rId10"/>
+                    <a:stretch>
+                      <a:fillRect/>
+                    </a:stretch>
+                  </pic:blipFill>
+                  <pic:spPr>
+                    <a:xfrm>
+                      <a:off x="0" y="0"/>
+                      <a:ext cx="3915577" cy="3438384"/>
+                    </a:xfrm>
+                    <a:prstGeom prst="rect">
+                      <a:avLst/>
+                    </a:prstGeom>
+                  </pic:spPr>
+                </pic:pic>
+              </a:graphicData>
+            </a:graphic>
+          </wp:inline>
+        </w:drawing>
       </w:r>
     </w:p>
     <w:p>
@@ -855,12 +887,54 @@
         </w:rPr>
       </w:pPr>
       <w:r>
-        <w:object w:dxaOrig="7845" w:dyaOrig="6893" w14:anchorId="177E1B21">
-          <v:rect id="rectole0000000002" o:spid="_x0000_i1027" style="width:392.4pt;height:344.4pt" o:ole="" o:preferrelative="t" stroked="f">
-            <v:imagedata r:id="rId12" o:title=""/>
-          </v:rect>
-          <o:OLEObject Type="Embed" ProgID="StaticMetafile" ShapeID="rectole0000000002" DrawAspect="Content" ObjectID="_1818510835" r:id="rId13"/>
-        </w:object>
+        <w:rPr>
+          <w:rFonts w:ascii="Calibri" w:eastAsia="Calibri" w:hAnsi="Calibri" w:cs="Calibri"/>
+          <w:sz w:val="22"/>
+        </w:rPr>
+        <w:drawing>
+          <wp:inline distT="0" distB="0" distL="0" distR="0" wp14:anchorId="71839B41" wp14:editId="7A875A84">
+            <wp:extent cx="3946525" cy="3378200"/>
+            <wp:effectExtent l="0" t="0" r="0" b="0"/>
+            <wp:docPr id="1542657541" name="Immagine 1"/>
+            <wp:cNvGraphicFramePr>
+              <a:graphicFrameLocks xmlns:a="http://schemas.openxmlformats.org/drawingml/2006/main" noChangeAspect="1"/>
+            </wp:cNvGraphicFramePr>
+            <a:graphic xmlns:a="http://schemas.openxmlformats.org/drawingml/2006/main">
+              <a:graphicData uri="http://schemas.openxmlformats.org/drawingml/2006/picture">
+                <pic:pic xmlns:pic="http://schemas.openxmlformats.org/drawingml/2006/picture">
+                  <pic:nvPicPr>
+                    <pic:cNvPr id="1542657541" name=""/>
+                    <pic:cNvPicPr/>
+                  </pic:nvPicPr>
+                  <pic:blipFill rotWithShape="1">
+                    <a:blip r:embed="rId11"/>
+                    <a:srcRect b="2200"/>
+                    <a:stretch>
+                      <a:fillRect/>
+                    </a:stretch>
+                  </pic:blipFill>
+                  <pic:spPr bwMode="auto">
+                    <a:xfrm>
+                      <a:off x="0" y="0"/>
+                      <a:ext cx="3958023" cy="3388042"/>
+                    </a:xfrm>
+                    <a:prstGeom prst="rect">
+                      <a:avLst/>
+                    </a:prstGeom>
+                    <a:ln>
+                      <a:noFill/>
+                    </a:ln>
+                    <a:extLst>
+                      <a:ext uri="{53640926-AAD7-44D8-BBD7-CCE9431645EC}">
+                        <a14:shadowObscured xmlns:a14="http://schemas.microsoft.com/office/drawing/2010/main"/>
+                      </a:ext>
+                    </a:extLst>
+                  </pic:spPr>
+                </pic:pic>
+              </a:graphicData>
+            </a:graphic>
+          </wp:inline>
+        </w:drawing>
       </w:r>
     </w:p>
     <w:p>
@@ -895,88 +969,53 @@
     <w:p>
       <w:pPr>
         <w:spacing w:after="200" w:line="276" w:lineRule="auto"/>
+        <w:jc w:val="center"/>
         <w:rPr>
           <w:rFonts w:ascii="Consolas" w:eastAsia="Consolas" w:hAnsi="Consolas" w:cs="Consolas"/>
           <w:b/>
         </w:rPr>
       </w:pPr>
-    </w:p>
-    <w:p>
-      <w:pPr>
-        <w:spacing w:after="200" w:line="276" w:lineRule="auto"/>
-        <w:jc w:val="center"/>
+      <w:r>
         <w:rPr>
           <w:rFonts w:ascii="Consolas" w:eastAsia="Consolas" w:hAnsi="Consolas" w:cs="Consolas"/>
           <w:b/>
         </w:rPr>
-      </w:pPr>
-    </w:p>
-    <w:p>
-      <w:pPr>
-        <w:spacing w:after="200" w:line="276" w:lineRule="auto"/>
-        <w:jc w:val="center"/>
-        <w:rPr>
-          <w:rFonts w:ascii="Consolas" w:eastAsia="Consolas" w:hAnsi="Consolas" w:cs="Consolas"/>
-          <w:b/>
-        </w:rPr>
-      </w:pPr>
-    </w:p>
-    <w:p>
-      <w:pPr>
-        <w:spacing w:after="200" w:line="276" w:lineRule="auto"/>
-        <w:jc w:val="center"/>
-        <w:rPr>
-          <w:rFonts w:ascii="Consolas" w:eastAsia="Consolas" w:hAnsi="Consolas" w:cs="Consolas"/>
-          <w:b/>
-        </w:rPr>
-      </w:pPr>
-    </w:p>
-    <w:p>
-      <w:pPr>
-        <w:spacing w:after="200" w:line="276" w:lineRule="auto"/>
-        <w:jc w:val="center"/>
-        <w:rPr>
-          <w:rFonts w:ascii="Consolas" w:eastAsia="Consolas" w:hAnsi="Consolas" w:cs="Consolas"/>
-          <w:b/>
-        </w:rPr>
-      </w:pPr>
-    </w:p>
-    <w:p>
-      <w:pPr>
-        <w:spacing w:after="200" w:line="276" w:lineRule="auto"/>
-        <w:jc w:val="center"/>
-        <w:rPr>
-          <w:rFonts w:ascii="Consolas" w:eastAsia="Consolas" w:hAnsi="Consolas" w:cs="Consolas"/>
-          <w:b/>
-        </w:rPr>
-      </w:pPr>
-    </w:p>
-    <w:p>
-      <w:pPr>
-        <w:spacing w:after="200" w:line="276" w:lineRule="auto"/>
-        <w:jc w:val="center"/>
-        <w:rPr>
-          <w:rFonts w:ascii="Consolas" w:eastAsia="Consolas" w:hAnsi="Consolas" w:cs="Consolas"/>
-          <w:b/>
-        </w:rPr>
-      </w:pPr>
-    </w:p>
-    <w:p>
-      <w:pPr>
-        <w:spacing w:after="200" w:line="276" w:lineRule="auto"/>
-        <w:jc w:val="center"/>
-        <w:rPr>
-          <w:rFonts w:ascii="Consolas" w:eastAsia="Consolas" w:hAnsi="Consolas" w:cs="Consolas"/>
-          <w:b/>
-        </w:rPr>
-      </w:pPr>
-      <w:r>
-        <w:object w:dxaOrig="10394" w:dyaOrig="4300" w14:anchorId="5BE37942">
-          <v:rect id="rectole0000000003" o:spid="_x0000_i1028" style="width:457.2pt;height:203.4pt" o:ole="" o:preferrelative="t" stroked="f">
-            <v:imagedata r:id="rId14" o:title=""/>
-          </v:rect>
-          <o:OLEObject Type="Embed" ProgID="StaticMetafile" ShapeID="rectole0000000003" DrawAspect="Content" ObjectID="_1818510836" r:id="rId15"/>
-        </w:object>
+        <w:lastRenderedPageBreak/>
+        <w:drawing>
+          <wp:inline distT="0" distB="0" distL="0" distR="0" wp14:anchorId="1D40B77D" wp14:editId="59F24FF4">
+            <wp:extent cx="5731510" cy="2406015"/>
+            <wp:effectExtent l="0" t="0" r="0" b="0"/>
+            <wp:docPr id="190631583" name="Immagine 1"/>
+            <wp:cNvGraphicFramePr>
+              <a:graphicFrameLocks xmlns:a="http://schemas.openxmlformats.org/drawingml/2006/main" noChangeAspect="1"/>
+            </wp:cNvGraphicFramePr>
+            <a:graphic xmlns:a="http://schemas.openxmlformats.org/drawingml/2006/main">
+              <a:graphicData uri="http://schemas.openxmlformats.org/drawingml/2006/picture">
+                <pic:pic xmlns:pic="http://schemas.openxmlformats.org/drawingml/2006/picture">
+                  <pic:nvPicPr>
+                    <pic:cNvPr id="190631583" name=""/>
+                    <pic:cNvPicPr/>
+                  </pic:nvPicPr>
+                  <pic:blipFill>
+                    <a:blip r:embed="rId12"/>
+                    <a:stretch>
+                      <a:fillRect/>
+                    </a:stretch>
+                  </pic:blipFill>
+                  <pic:spPr>
+                    <a:xfrm>
+                      <a:off x="0" y="0"/>
+                      <a:ext cx="5731510" cy="2406015"/>
+                    </a:xfrm>
+                    <a:prstGeom prst="rect">
+                      <a:avLst/>
+                    </a:prstGeom>
+                  </pic:spPr>
+                </pic:pic>
+              </a:graphicData>
+            </a:graphic>
+          </wp:inline>
+        </w:drawing>
       </w:r>
     </w:p>
     <w:p>
@@ -1036,7 +1075,7 @@
         <w:rPr>
           <w:rFonts w:ascii="Times New Roman" w:eastAsia="Times New Roman" w:hAnsi="Times New Roman" w:cs="Times New Roman"/>
         </w:rPr>
-        <w:t>Sinonimia: Word2Vec tende a riconoscere con maggior coerenza la similarità tra sinonimi e quasi sinonimi (es. big, large, huge), attribuendo valori elevati di similarità grazie all’uso frequente in contesti simili. WordNet, pur basandosi su relazioni lessicali esplicite, può restituire valori più bassi, specialmente se i sinonimi appartengono a synset distinti o poco collegati nella gerarchia.</w:t>
+        <w:t>Sinonimia: Word2Vec tende a riconoscere con maggior coerenza la similarità tra sinonimi e quasi sinonimi attribuendo valori elevati di similarità grazie all’uso frequente in contesti simili. WordNet, pur basandosi su relazioni lessicali esplicite, può restituire valori più bassi, specialmente se i sinonimi appartengono a synset distinti o poco collegati nella gerarchia.</w:t>
       </w:r>
     </w:p>
     <w:p>
@@ -1128,8 +1167,14 @@
         <w:rPr>
           <w:rFonts w:ascii="Times New Roman" w:eastAsia="Times New Roman" w:hAnsi="Times New Roman" w:cs="Times New Roman"/>
         </w:rPr>
+        <w:t xml:space="preserve">Concetti astratti vs concreti: Word2Vec riesce a cogliere la vicinanza tra concetti astratti (freedom, justice) se ricorrono in testi simili, mentre WordNet fatica a stabilire relazioni significative tra entità non concrete, spesso scarsamente collegate nella sua </w:t>
+      </w:r>
+      <w:r>
+        <w:rPr>
+          <w:rFonts w:ascii="Times New Roman" w:eastAsia="Times New Roman" w:hAnsi="Times New Roman" w:cs="Times New Roman"/>
+        </w:rPr>
         <w:lastRenderedPageBreak/>
-        <w:t>Concetti astratti vs concreti: Word2Vec riesce a cogliere la vicinanza tra concetti astratti (freedom, justice) se ricorrono in testi simili, mentre WordNet fatica a stabilire relazioni significative tra entità non concrete, spesso scarsamente collegate nella sua gerarchia. Per i concetti concreti (table, car), entrambe le risorse risultano più affidabili.</w:t>
+        <w:t>gerarchia. Per i concetti concreti (table, car), entrambe le risorse risultano più affidabili.</w:t>
       </w:r>
     </w:p>
     <w:p>
@@ -1276,7 +1321,7 @@
       </w:pPr>
     </w:p>
     <w:sectPr>
-      <w:footerReference w:type="default" r:id="rId16"/>
+      <w:footerReference w:type="default" r:id="rId13"/>
       <w:pgSz w:w="11906" w:h="16838"/>
       <w:pgMar w:top="1440" w:right="1440" w:bottom="1440" w:left="1440" w:header="720" w:footer="720" w:gutter="0"/>
       <w:cols w:space="720"/>

</xml_diff>